<commit_message>
plan preventa fase 1: precios unificados
Cotizador.xlsx y Leogin_Planes_y_Precios_2026.docx tenian precios
obsoletos (Premium en Q1,000 y Q749 respectivamente) que ya no
coincidian con plans.ts (Q599). Corregidos ambos, agregado
PRECIOS_VIGENTES.md como referencia rapida, y nueva hoja de ROI en
el cotizador para restaurantes que no usan apps de delivery hoy.

Co-Authored-By: Claude Sonnet 5 <noreply@anthropic.com>
</commit_message>
<xml_diff>
--- a/Leogin_Planes_y_Precios_2026.docx
+++ b/Leogin_Planes_y_Precios_2026.docx
@@ -117,7 +117,7 @@
           <w:sz w:val="21"/>
           <w:szCs w:val="21"/>
         </w:rPr>
-        <w:t xml:space="preserve">La nueva arquitectura tiene dos piezas: cuatro planes de precio fijo que cubren desde un menú digital simple hasta una operación completa, y ocho módulos que se compran sueltos sobre cualquier plan. Cada restaurante arma exactamente lo que necesita — nadie paga por herramientas que no usa, y nadie ve su factura subir porque tuvo un buen mes.</w:t>
+        <w:t>La nueva arquitectura tiene dos piezas: cuatro planes de precio fijo que cubren desde un menú digital simple hasta una operación completa, y nueve módulos que se compran sueltos sobre cualquier plan. Cada restaurante arma exactamente lo que necesita — nadie paga por herramientas que no usa, y nadie ve su factura subir porque tuvo un buen mes.</w:t>
       </w:r>
     </w:p>
     <w:p>
@@ -197,6 +197,27 @@
           <w:szCs w:val="21"/>
         </w:rPr>
         <w:t xml:space="preserve">El plan Pro y los módulos de Proveedores y Factura Electrónica (FEL) están construidos y listos en el código, pero por ahora quedan fuera de lo que se le ofrece a clientes — decisión tuya, mientras esas dos funciones terminan de estar listas. Todo lo demás de este documento (Básico, Estándar, Premium, descuentos por sucursal) está activo y disponible hoy. Se marca "(pausado)" donde aplica.</w:t>
+      </w:r>
+    </w:p>
+    <w:p>
+      <w:pPr>
+        <w:spacing w:after="160" w:line="300"/>
+      </w:pPr>
+      <w:r>
+        <w:rPr>
+          <w:b/>
+          <w:bCs/>
+          <w:sz w:val="21"/>
+          <w:szCs w:val="21"/>
+        </w:rPr>
+        <w:t xml:space="preserve">Actualización (2026-07-24): precios y módulos avanzaron de nuevo. </w:t>
+      </w:r>
+      <w:r>
+        <w:rPr>
+          <w:sz w:val="21"/>
+          <w:szCs w:val="21"/>
+        </w:rPr>
+        <w:t>Desde que se escribió este documento (12 de julio), Estándar y Premium bajaron a Q299 y Q599 (14 de julio), Básico pasó a ser gratis para siempre con un tope de 150 productos (22 de julio), y se agregó un noveno módulo, Lista de espera (Q49/mes, incluido gratis en Premium y Pro). Estándar además ahora incluye reportes financieros y corte de caja. Las tablas y ejemplos de este documento ya se actualizaron hoy (2026-07-24) con estos montos — lo que no cambia es el razonamiento del rediseño (piso fijo + módulos a la carta, sin cobro por GMV) descrito abajo. Para la referencia más rápida antes de una visita, usa PRECIOS_VIGENTES.md.</w:t>
       </w:r>
     </w:p>
     <w:p>
@@ -1362,7 +1383,7 @@
           <w:sz w:val="21"/>
           <w:szCs w:val="21"/>
         </w:rPr>
-        <w:t xml:space="preserve">La idea es simple: cada plan es un piso de funciones fijas por un precio fijo. Encima, ocho módulos se compran sueltos sobre cualquier plan — así el restaurante arma exactamente lo que necesita, sin pagar por lo que no usa, y siempre entendiendo por qué paga lo que paga.</w:t>
+        <w:t>La idea es simple: cada plan es un piso de funciones fijas por un precio fijo. Encima, nueve módulos se compran sueltos sobre cualquier plan — así el restaurante arma exactamente lo que necesita, sin pagar por lo que no usa, y siempre entendiendo por qué paga lo que paga.</w:t>
       </w:r>
     </w:p>
     <w:p>
@@ -1560,7 +1581,7 @@
                 <w:sz w:val="19"/>
                 <w:szCs w:val="19"/>
               </w:rPr>
-              <w:t xml:space="preserve">Q149 /mes</w:t>
+              <w:t>Gratis</w:t>
             </w:r>
           </w:p>
         </w:tc>
@@ -1614,7 +1635,7 @@
                 <w:sz w:val="19"/>
                 <w:szCs w:val="19"/>
               </w:rPr>
-              <w:t xml:space="preserve">Negocios chicos que solo necesitan mostrar su carta: menú digital con QR, productos ilimitados, marca propia. Sin pedidos en línea. 1 usuario.</w:t>
+              <w:t>Negocios chicos que solo necesitan mostrar su carta: menú digital con QR, hasta 150 productos, marca propia. Sin pedidos en línea. 1 usuario. Aviso (no bloqueo) a partir de 3,000 visitas/mes al menú.</w:t>
             </w:r>
           </w:p>
         </w:tc>
@@ -1670,7 +1691,7 @@
                 <w:sz w:val="19"/>
                 <w:szCs w:val="19"/>
               </w:rPr>
-              <w:t xml:space="preserve">Q399 /mes</w:t>
+              <w:t>Q299 /mes</w:t>
             </w:r>
           </w:p>
         </w:tc>
@@ -1724,7 +1745,7 @@
                 <w:sz w:val="19"/>
                 <w:szCs w:val="19"/>
               </w:rPr>
-              <w:t xml:space="preserve">Restaurantes que ya quieren vender en línea: pedidos para llevar o a domicilio, aviso por WhatsApp, notificaciones en tiempo real. 2 usuarios.</w:t>
+              <w:t>Restaurantes que ya quieren vender en línea: elige 2 de los 3 canales de pedido (comer en local, para llevar o a domicilio), aviso por WhatsApp, notificaciones en tiempo real, reportes financieros y corte de caja. 2 usuarios.</w:t>
             </w:r>
           </w:p>
         </w:tc>
@@ -1780,7 +1801,7 @@
                 <w:sz w:val="19"/>
                 <w:szCs w:val="19"/>
               </w:rPr>
-              <w:t xml:space="preserve">Q749 /mes</w:t>
+              <w:t>Q599 /mes</w:t>
             </w:r>
           </w:p>
         </w:tc>
@@ -1834,7 +1855,7 @@
                 <w:sz w:val="19"/>
                 <w:szCs w:val="19"/>
               </w:rPr>
-              <w:t xml:space="preserve">El plan más completo para operación diaria: los 3 canales de pedido, panel de mesero, personalización total, finanzas/inventario/analítica, y 6 de los 8 módulos incluidos gratis. Usuarios ilimitados. Participa del descuento "Plan a tu medida".</w:t>
+              <w:t>El plan más completo para operación diaria: los 3 canales de pedido, panel de mesero, personalización total, finanzas/inventario/analítica, y 7 de los 9 módulos incluidos gratis. Usuarios ilimitados. Participa del descuento "Plan a tu medida".</w:t>
             </w:r>
           </w:p>
         </w:tc>
@@ -1971,7 +1992,7 @@
         <w:spacing w:after="140" w:before="300"/>
       </w:pPr>
       <w:r>
-        <w:t xml:space="preserve">3.2 — Los ocho módulos a la carta</w:t>
+        <w:t>3.2 — Los nueve módulos a la carta</w:t>
       </w:r>
     </w:p>
     <w:p>
@@ -2255,6 +2276,116 @@
                 <w:sz w:val="19"/>
                 <w:szCs w:val="19"/>
               </w:rPr>
+              <w:t>Lista de espera</w:t>
+            </w:r>
+          </w:p>
+        </w:tc>
+        <w:tc>
+          <w:tcPr>
+            <w:tcW w:type="dxa" w:w="1500"/>
+            <w:tcMar>
+              <w:top w:type="dxa" w:w="90"/>
+              <w:left w:type="dxa" w:w="110"/>
+              <w:bottom w:type="dxa" w:w="90"/>
+              <w:right w:type="dxa" w:w="110"/>
+            </w:tcMar>
+            <w:vAlign w:val="center"/>
+          </w:tcPr>
+          <w:p>
+            <w:pPr>
+              <w:jc w:val="left"/>
+            </w:pPr>
+            <w:r>
+              <w:rPr>
+                <w:b w:val="false"/>
+                <w:bCs w:val="false"/>
+                <w:color w:val="6B7280"/>
+                <w:sz w:val="19"/>
+                <w:szCs w:val="19"/>
+              </w:rPr>
+              <w:t>Q49 /mes</w:t>
+            </w:r>
+          </w:p>
+        </w:tc>
+        <w:tc>
+          <w:tcPr>
+            <w:tcW w:type="dxa" w:w="1750"/>
+            <w:tcMar>
+              <w:top w:type="dxa" w:w="90"/>
+              <w:left w:type="dxa" w:w="110"/>
+              <w:bottom w:type="dxa" w:w="90"/>
+              <w:right w:type="dxa" w:w="110"/>
+            </w:tcMar>
+            <w:vAlign w:val="center"/>
+          </w:tcPr>
+          <w:p>
+            <w:pPr>
+              <w:jc w:val="left"/>
+            </w:pPr>
+            <w:r>
+              <w:rPr>
+                <w:b w:val="false"/>
+                <w:bCs w:val="false"/>
+                <w:color w:val="6B7280"/>
+                <w:sz w:val="19"/>
+                <w:szCs w:val="19"/>
+              </w:rPr>
+              <w:t>Básico</w:t>
+            </w:r>
+          </w:p>
+        </w:tc>
+        <w:tc>
+          <w:tcPr>
+            <w:tcW w:type="dxa" w:w="3700"/>
+            <w:tcMar>
+              <w:top w:type="dxa" w:w="90"/>
+              <w:left w:type="dxa" w:w="110"/>
+              <w:bottom w:type="dxa" w:w="90"/>
+              <w:right w:type="dxa" w:w="110"/>
+            </w:tcMar>
+            <w:vAlign w:val="center"/>
+          </w:tcPr>
+          <w:p>
+            <w:pPr>
+              <w:jc w:val="left"/>
+            </w:pPr>
+            <w:r>
+              <w:rPr>
+                <w:b w:val="false"/>
+                <w:bCs w:val="false"/>
+                <w:color w:val="6B7280"/>
+                <w:sz w:val="19"/>
+                <w:szCs w:val="19"/>
+              </w:rPr>
+              <w:t>Premium y Pro</w:t>
+            </w:r>
+          </w:p>
+        </w:tc>
+      </w:tr>
+      <w:tr>
+        <w:tc>
+          <w:tcPr>
+            <w:tcW w:type="dxa" w:w="2400"/>
+            <w:tcMar>
+              <w:top w:type="dxa" w:w="90"/>
+              <w:left w:type="dxa" w:w="110"/>
+              <w:bottom w:type="dxa" w:w="90"/>
+              <w:right w:type="dxa" w:w="110"/>
+            </w:tcMar>
+            <w:vAlign w:val="center"/>
+          </w:tcPr>
+          <w:p>
+            <w:pPr>
+              <w:jc w:val="left"/>
+            </w:pPr>
+            <w:r>
+              <w:rPr>
+                <w:b w:val="false"/>
+                <w:bCs w:val="false"/>
+                <w:color w:val="6B7280"/>
+                <w:sz w:val="19"/>
+                <w:szCs w:val="19"/>
+              </w:rPr>
               <w:t xml:space="preserve">Llamar al mesero</w:t>
             </w:r>
           </w:p>
@@ -3033,7 +3164,7 @@
           <w:sz w:val="21"/>
           <w:szCs w:val="21"/>
         </w:rPr>
-        <w:t xml:space="preserve">Este mecanismo ya existía parcialmente en Leogin y se mantiene: en Premium y Pro, cada canal de servicio que el restaurante no usa (local/para llevar, o domicilio) descuenta Q100 de la mensualidad, hasta un máximo de un canal — siempre se paga al menos uno. Es la pieza que ya apuntaba en la dirección correcta antes de este rediseño; ahora convive con los módulos a la carta bajo la misma lógica: paga por lo que usas, nada más.</w:t>
+        <w:t>Este mecanismo ya existía parcialmente en Leogin y se mantiene, aunque el monto y el tope cambiaron desde que se escribió este documento (ver actualización arriba): en Premium y Pro, cada uno de los 3 canales de servicio (comer en local, para llevar, a domicilio) que el restaurante decide no usar descuenta Q50 de la mensualidad, hasta un máximo de 2 canales desactivados — siempre se paga al menos un canal completo. Es la pieza que ya apuntaba en la dirección correcta antes de este rediseño; ahora convive con los módulos a la carta bajo la misma lógica: paga por lo que usas, nada más.</w:t>
       </w:r>
     </w:p>
     <w:p>
@@ -3460,7 +3591,7 @@
         <w:spacing w:after="100" w:line="280"/>
       </w:pPr>
       <w:r>
-        <w:t xml:space="preserve">Sucursal fundadora: Q749 (precio completo)</w:t>
+        <w:t>Sucursal fundadora: Q599 (precio completo)</w:t>
       </w:r>
     </w:p>
     <w:p>
@@ -3473,7 +3604,7 @@
         <w:spacing w:after="100" w:line="280"/>
       </w:pPr>
       <w:r>
-        <w:t xml:space="preserve">5 sucursales adicionales (grupo de 6 → tramo "5–9 sucursales" → 15% de descuento): Q749 × 0.85 = Q637 cada una → Q3,185</w:t>
+        <w:t>5 sucursales adicionales (grupo de 6 → tramo "5–9 sucursales" → 15% de descuento): Q599 × 0.85 = Q509.15 cada una → Q2,545.75</w:t>
       </w:r>
     </w:p>
     <w:p>
@@ -3500,7 +3631,7 @@
           <w:sz w:val="21"/>
           <w:szCs w:val="21"/>
         </w:rPr>
-        <w:t xml:space="preserve">Total del grupo: Q4,233/mes</w:t>
+        <w:t>Total del grupo: Q3,443.75/mes</w:t>
       </w:r>
       <w:r>
         <w:rPr>
@@ -3537,7 +3668,7 @@
           <w:sz w:val="21"/>
           <w:szCs w:val="21"/>
         </w:rPr>
-        <w:t xml:space="preserve">Solo necesita mostrar su carta con fotos y precios. Básico — Q149/mes.</w:t>
+        <w:t>Solo necesita mostrar su carta con fotos y precios. Básico — Gratis (hasta 150 productos).</w:t>
       </w:r>
     </w:p>
     <w:p>
@@ -3558,7 +3689,7 @@
           <w:sz w:val="21"/>
           <w:szCs w:val="21"/>
         </w:rPr>
-        <w:t xml:space="preserve">Pedidos para llevar con aviso por WhatsApp. Estándar — Q399/mes.</w:t>
+        <w:t>Pedidos para llevar con aviso por WhatsApp. Estándar — Q299/mes.</w:t>
       </w:r>
     </w:p>
     <w:p>
@@ -3579,7 +3710,7 @@
           <w:sz w:val="21"/>
           <w:szCs w:val="21"/>
         </w:rPr>
-        <w:t xml:space="preserve">Los 3 canales de pedido, panel de mesero, cupones y programa de lealtad ya vienen incluidos. Premium — Q749/mes.</w:t>
+        <w:t>Los 3 canales de pedido, panel de mesero, cupones y programa de lealtad ya vienen incluidos. Premium — Q599/mes.</w:t>
       </w:r>
     </w:p>
     <w:p>
@@ -3853,7 +3984,7 @@
         <w:spacing w:after="100" w:line="280"/>
       </w:pPr>
       <w:r>
-        <w:t xml:space="preserve">Actualizar el Cotizador.xlsx con las cifras nuevas (Premium ahora Q749, ya no Q1,000).</w:t>
+        <w:t>Actualizar el Cotizador.xlsx con las cifras nuevas (Premium ahora Q599, ya no Q1,000).</w:t>
       </w:r>
     </w:p>
     <w:p>

</xml_diff>

<commit_message>
precios de lanzamiento 2026: Estandar Q299->Q199, Premium Q599->Q349
Sin clientes aun, se baja toda la escalera para quedar dentro de la
banda real del mercado guatemalteco (Q200-Q475). Pro se reubica a
Q599 (sigue pausado). Migracion 111 reconcilia platform_settings;
falta correrla en produccion via SQL Editor de Supabase.

Co-Authored-By: Claude Sonnet 5 <noreply@anthropic.com>
</commit_message>
<xml_diff>
--- a/Leogin_Planes_y_Precios_2026.docx
+++ b/Leogin_Planes_y_Precios_2026.docx
@@ -218,6 +218,27 @@
           <w:szCs w:val="21"/>
         </w:rPr>
         <w:t>Desde que se escribió este documento (12 de julio), Estándar y Premium bajaron a Q299 y Q599 (14 de julio), Básico pasó a ser gratis para siempre con un tope de 150 productos (22 de julio), y se agregó un noveno módulo, Lista de espera (Q49/mes, incluido gratis en Premium y Pro). Estándar además ahora incluye reportes financieros y corte de caja. Las tablas y ejemplos de este documento ya se actualizaron hoy (2026-07-24) con estos montos — lo que no cambia es el razonamiento del rediseño (piso fijo + módulos a la carta, sin cobro por GMV) descrito abajo. Para la referencia más rápida antes de una visita, usa PRECIOS_VIGENTES.md.</w:t>
+      </w:r>
+    </w:p>
+    <w:p>
+      <w:pPr>
+        <w:spacing w:after="160" w:line="300"/>
+      </w:pPr>
+      <w:r>
+        <w:rPr>
+          <w:b/>
+          <w:bCs/>
+          <w:sz w:val="21"/>
+          <w:szCs w:val="21"/>
+        </w:rPr>
+        <w:t xml:space="preserve">Actualización (2026-08-17): precios de lanzamiento, ahora oficiales. </w:t>
+      </w:r>
+      <w:r>
+        <w:rPr>
+          <w:sz w:val="21"/>
+          <w:szCs w:val="21"/>
+        </w:rPr>
+        <w:t xml:space="preserve">Toda la escalera bajó de una vez: Estándar Q299 → Q199, Premium Q599 → Q349, y Pro Q999 → Q599 (Pro sigue pausado; se reubicó para no dejar un hueco de 2.9x sobre Premium cuando se reactive). Se bajaron los tres juntos a propósito: mover solo Premium habría dejado apenas Q50 de diferencia con Estándar y habría matado ese plan. La razón de fondo es de mercado — la banda real en Guatemala es Q200–Q475 (PosFile Q200/300/475, Vendty Q315, Sabor Suite ~Q343), así que Estándar ahora queda debajo de toda la banda y Premium dentro de ella. El costo de alta (Q300) no cambia y sigue siendo el más barato del mercado: PosFile cobra entre Q700 y Q2,150 por lo mismo. Se agregó además pago anual (Estándar Q169/mes, Premium Q299/mes pagando el año). Las tablas y ejemplos de este documento ya reflejan los montos nuevos; el razonamiento del rediseño no cambia. Aplicado en plans.ts y en la migración 111_precios_lanzamiento.sql — falta correrla en producción.</w:t>
       </w:r>
     </w:p>
     <w:p>
@@ -1691,7 +1712,7 @@
                 <w:sz w:val="19"/>
                 <w:szCs w:val="19"/>
               </w:rPr>
-              <w:t>Q299 /mes</w:t>
+              <w:t>Q199 /mes</w:t>
             </w:r>
           </w:p>
         </w:tc>
@@ -1801,7 +1822,7 @@
                 <w:sz w:val="19"/>
                 <w:szCs w:val="19"/>
               </w:rPr>
-              <w:t>Q599 /mes</w:t>
+              <w:t>Q349 /mes</w:t>
             </w:r>
           </w:p>
         </w:tc>
@@ -1911,7 +1932,7 @@
                 <w:sz w:val="19"/>
                 <w:szCs w:val="19"/>
               </w:rPr>
-              <w:t xml:space="preserve">Q999 /mes</w:t>
+              <w:t xml:space="preserve">Q599 /mes</w:t>
             </w:r>
           </w:p>
         </w:tc>
@@ -3591,7 +3612,7 @@
         <w:spacing w:after="100" w:line="280"/>
       </w:pPr>
       <w:r>
-        <w:t>Sucursal fundadora: Q599 (precio completo)</w:t>
+        <w:t>Sucursal fundadora: Q349 (precio completo)</w:t>
       </w:r>
     </w:p>
     <w:p>
@@ -3604,7 +3625,7 @@
         <w:spacing w:after="100" w:line="280"/>
       </w:pPr>
       <w:r>
-        <w:t>5 sucursales adicionales (grupo de 6 → tramo "5–9 sucursales" → 15% de descuento): Q599 × 0.85 = Q509.15 cada una → Q2,545.75</w:t>
+        <w:t>5 sucursales adicionales (grupo de 6 → tramo "5–9 sucursales" → 15% de descuento): Q349 × 0.85 = Q296.65 cada una → Q1,483.25</w:t>
       </w:r>
     </w:p>
     <w:p>
@@ -3631,7 +3652,7 @@
           <w:sz w:val="21"/>
           <w:szCs w:val="21"/>
         </w:rPr>
-        <w:t>Total del grupo: Q3,443.75/mes</w:t>
+        <w:t>Total del grupo: Q2,131.25/mes</w:t>
       </w:r>
       <w:r>
         <w:rPr>
@@ -3689,7 +3710,7 @@
           <w:sz w:val="21"/>
           <w:szCs w:val="21"/>
         </w:rPr>
-        <w:t>Pedidos para llevar con aviso por WhatsApp. Estándar — Q299/mes.</w:t>
+        <w:t>Pedidos para llevar con aviso por WhatsApp. Estándar — Q199/mes.</w:t>
       </w:r>
     </w:p>
     <w:p>
@@ -3710,7 +3731,7 @@
           <w:sz w:val="21"/>
           <w:szCs w:val="21"/>
         </w:rPr>
-        <w:t>Los 3 canales de pedido, panel de mesero, cupones y programa de lealtad ya vienen incluidos. Premium — Q599/mes.</w:t>
+        <w:t>Los 3 canales de pedido, panel de mesero, cupones y programa de lealtad ya vienen incluidos. Premium — Q349/mes.</w:t>
       </w:r>
     </w:p>
     <w:p>
@@ -3731,7 +3752,7 @@
           <w:sz w:val="21"/>
           <w:szCs w:val="21"/>
         </w:rPr>
-        <w:t xml:space="preserve">Todo Premium más FEL y proveedores, sin pagarlos sueltos. Pro — Q999/mes. Este escenario queda listo para cuando reactives Pro; hoy este tipo de restaurante se queda en Premium.</w:t>
+        <w:t xml:space="preserve">Todo Premium más FEL y proveedores, sin pagarlos sueltos. Pro — Q599/mes. Este escenario queda listo para cuando reactives Pro; hoy este tipo de restaurante se queda en Premium.</w:t>
       </w:r>
     </w:p>
     <w:p>
@@ -3984,7 +4005,7 @@
         <w:spacing w:after="100" w:line="280"/>
       </w:pPr>
       <w:r>
-        <w:t>Actualizar el Cotizador.xlsx con las cifras nuevas (Premium ahora Q599, ya no Q1,000).</w:t>
+        <w:t>Actualizar el Cotizador.xlsx con las cifras nuevas (Premium ahora Q349).</w:t>
       </w:r>
     </w:p>
     <w:p>

</xml_diff>